<commit_message>
Version final du document word
</commit_message>
<xml_diff>
--- a/TP 2 GIT H26.docx
+++ b/TP 2 GIT H26.docx
@@ -9,6 +9,13 @@
           <w:sz w:val="22"/>
         </w:rPr>
       </w:pPr>
+      <w:r>
+        <w:rPr>
+          <w:b/>
+          <w:sz w:val="22"/>
+        </w:rPr>
+        <w:t xml:space="preserve">NOM : Christophe , Raphael </w:t>
+      </w:r>
     </w:p>
     <w:tbl>
       <w:tblPr>
@@ -337,7 +344,7 @@
     </w:p>
     <w:p>
       <w:pPr>
-        <w:pStyle w:val="ListParagraph"/>
+        <w:pStyle w:val="Paragraphedeliste"/>
         <w:numPr>
           <w:ilvl w:val="0"/>
           <w:numId w:val="13"/>
@@ -360,7 +367,7 @@
     </w:p>
     <w:p>
       <w:pPr>
-        <w:pStyle w:val="ListParagraph"/>
+        <w:pStyle w:val="Paragraphedeliste"/>
         <w:numPr>
           <w:ilvl w:val="0"/>
           <w:numId w:val="13"/>
@@ -390,7 +397,7 @@
     </w:p>
     <w:p>
       <w:pPr>
-        <w:pStyle w:val="ListParagraph"/>
+        <w:pStyle w:val="Paragraphedeliste"/>
         <w:numPr>
           <w:ilvl w:val="0"/>
           <w:numId w:val="13"/>
@@ -441,7 +448,7 @@
     </w:p>
     <w:p>
       <w:pPr>
-        <w:pStyle w:val="ListParagraph"/>
+        <w:pStyle w:val="Paragraphedeliste"/>
         <w:numPr>
           <w:ilvl w:val="0"/>
           <w:numId w:val="13"/>
@@ -464,7 +471,7 @@
     </w:p>
     <w:p>
       <w:pPr>
-        <w:pStyle w:val="ListParagraph"/>
+        <w:pStyle w:val="Paragraphedeliste"/>
         <w:tabs>
           <w:tab w:val="left" w:pos="851"/>
         </w:tabs>
@@ -752,7 +759,7 @@
     </w:p>
     <w:p>
       <w:pPr>
-        <w:pStyle w:val="Heading2"/>
+        <w:pStyle w:val="Titre2"/>
         <w:ind w:firstLine="360"/>
         <w:rPr>
           <w:sz w:val="24"/>
@@ -869,7 +876,7 @@
     </w:p>
     <w:tbl>
       <w:tblPr>
-        <w:tblStyle w:val="TableGrid"/>
+        <w:tblStyle w:val="Grilledutableau"/>
         <w:tblW w:w="0" w:type="auto"/>
         <w:tblInd w:w="360" w:type="dxa"/>
         <w:tblLook w:val="04A0" w:firstRow="1" w:lastRow="0" w:firstColumn="1" w:lastColumn="0" w:noHBand="0" w:noVBand="1"/>
@@ -892,6 +899,12 @@
             </w:pPr>
             <w:r>
               <w:t>Écrivez ici l’Url de votre dépôt :</w:t>
+            </w:r>
+            <w:r>
+              <w:t xml:space="preserve"> </w:t>
+            </w:r>
+            <w:r>
+              <w:t>https://github.com/ChrisDuss/TP2-CD-RM.git</w:t>
             </w:r>
           </w:p>
           <w:p>
@@ -926,7 +939,7 @@
     </w:tbl>
     <w:p>
       <w:pPr>
-        <w:pStyle w:val="Heading2"/>
+        <w:pStyle w:val="Titre2"/>
         <w:ind w:firstLine="360"/>
         <w:rPr>
           <w:sz w:val="24"/>
@@ -952,7 +965,7 @@
     </w:p>
     <w:p>
       <w:pPr>
-        <w:pStyle w:val="Heading2"/>
+        <w:pStyle w:val="Titre2"/>
         <w:ind w:firstLine="360"/>
         <w:rPr>
           <w:sz w:val="24"/>
@@ -1006,20 +1019,20 @@
     </w:p>
     <w:p>
       <w:pPr>
-        <w:pStyle w:val="Heading3"/>
-        <w:rPr>
-          <w:rStyle w:val="IntenseEmphasis"/>
-        </w:rPr>
-      </w:pPr>
-      <w:r>
-        <w:rPr>
-          <w:rStyle w:val="IntenseEmphasis"/>
+        <w:pStyle w:val="Titre3"/>
+        <w:rPr>
+          <w:rStyle w:val="Accentuationintense"/>
+        </w:rPr>
+      </w:pPr>
+      <w:r>
+        <w:rPr>
+          <w:rStyle w:val="Accentuationintense"/>
         </w:rPr>
         <w:t>Création de nouvelles classes</w:t>
       </w:r>
       <w:r>
         <w:rPr>
-          <w:rStyle w:val="IntenseEmphasis"/>
+          <w:rStyle w:val="Accentuationintense"/>
         </w:rPr>
         <w:t> :</w:t>
       </w:r>
@@ -1034,7 +1047,7 @@
     </w:p>
     <w:p>
       <w:pPr>
-        <w:pStyle w:val="ListParagraph"/>
+        <w:pStyle w:val="Paragraphedeliste"/>
         <w:numPr>
           <w:ilvl w:val="0"/>
           <w:numId w:val="17"/>
@@ -1042,12 +1055,14 @@
         <w:rPr>
           <w:sz w:val="24"/>
           <w:szCs w:val="24"/>
-        </w:rPr>
-      </w:pPr>
-      <w:r>
-        <w:rPr>
-          <w:sz w:val="24"/>
-          <w:szCs w:val="24"/>
+          <w:highlight w:val="red"/>
+        </w:rPr>
+      </w:pPr>
+      <w:r>
+        <w:rPr>
+          <w:sz w:val="24"/>
+          <w:szCs w:val="24"/>
+          <w:highlight w:val="red"/>
         </w:rPr>
         <w:t>Un équipier va créer une classe</w:t>
       </w:r>
@@ -1055,6 +1070,7 @@
         <w:rPr>
           <w:sz w:val="24"/>
           <w:szCs w:val="24"/>
+          <w:highlight w:val="red"/>
         </w:rPr>
         <w:t xml:space="preserve"> </w:t>
       </w:r>
@@ -1062,6 +1078,7 @@
         <w:rPr>
           <w:sz w:val="24"/>
           <w:szCs w:val="24"/>
+          <w:highlight w:val="red"/>
         </w:rPr>
         <w:t>Serie</w:t>
       </w:r>
@@ -1069,6 +1086,7 @@
         <w:rPr>
           <w:sz w:val="24"/>
           <w:szCs w:val="24"/>
+          <w:highlight w:val="red"/>
         </w:rPr>
         <w:t>, qui modélise une série d’ouvrages</w:t>
       </w:r>
@@ -1076,6 +1094,7 @@
         <w:rPr>
           <w:sz w:val="24"/>
           <w:szCs w:val="24"/>
+          <w:highlight w:val="red"/>
         </w:rPr>
         <w:t xml:space="preserve"> du même genre</w:t>
       </w:r>
@@ -1083,6 +1102,7 @@
         <w:rPr>
           <w:sz w:val="24"/>
           <w:szCs w:val="24"/>
+          <w:highlight w:val="red"/>
         </w:rPr>
         <w:t>, celle-ci comporte simplement un nom et une liste d’ouvrages, initialement vide.</w:t>
       </w:r>
@@ -1090,13 +1110,14 @@
         <w:rPr>
           <w:sz w:val="24"/>
           <w:szCs w:val="24"/>
+          <w:highlight w:val="red"/>
         </w:rPr>
         <w:t xml:space="preserve"> </w:t>
       </w:r>
     </w:p>
     <w:p>
       <w:pPr>
-        <w:pStyle w:val="ListParagraph"/>
+        <w:pStyle w:val="Paragraphedeliste"/>
         <w:ind w:left="720"/>
         <w:rPr>
           <w:sz w:val="24"/>
@@ -1106,7 +1127,7 @@
     </w:p>
     <w:p>
       <w:pPr>
-        <w:pStyle w:val="ListParagraph"/>
+        <w:pStyle w:val="Paragraphedeliste"/>
         <w:numPr>
           <w:ilvl w:val="0"/>
           <w:numId w:val="17"/>
@@ -1114,12 +1135,14 @@
         <w:rPr>
           <w:sz w:val="24"/>
           <w:szCs w:val="24"/>
-        </w:rPr>
-      </w:pPr>
-      <w:r>
-        <w:rPr>
-          <w:sz w:val="24"/>
-          <w:szCs w:val="24"/>
+          <w:highlight w:val="yellow"/>
+        </w:rPr>
+      </w:pPr>
+      <w:r>
+        <w:rPr>
+          <w:sz w:val="24"/>
+          <w:szCs w:val="24"/>
+          <w:highlight w:val="yellow"/>
         </w:rPr>
         <w:t xml:space="preserve">L’autre équipier va créer une classe Pays </w:t>
       </w:r>
@@ -1127,6 +1150,7 @@
         <w:rPr>
           <w:sz w:val="24"/>
           <w:szCs w:val="24"/>
+          <w:highlight w:val="yellow"/>
         </w:rPr>
         <w:t>qui contient un nom</w:t>
       </w:r>
@@ -1134,6 +1158,7 @@
         <w:rPr>
           <w:sz w:val="24"/>
           <w:szCs w:val="24"/>
+          <w:highlight w:val="yellow"/>
         </w:rPr>
         <w:t xml:space="preserve"> et un </w:t>
       </w:r>
@@ -1141,6 +1166,7 @@
         <w:rPr>
           <w:sz w:val="24"/>
           <w:szCs w:val="24"/>
+          <w:highlight w:val="yellow"/>
         </w:rPr>
         <w:t>code de pays qui doit obligatoirement comporter</w:t>
       </w:r>
@@ -1148,6 +1174,7 @@
         <w:rPr>
           <w:sz w:val="24"/>
           <w:szCs w:val="24"/>
+          <w:highlight w:val="yellow"/>
         </w:rPr>
         <w:t xml:space="preserve"> exactement</w:t>
       </w:r>
@@ -1155,6 +1182,7 @@
         <w:rPr>
           <w:sz w:val="24"/>
           <w:szCs w:val="24"/>
+          <w:highlight w:val="yellow"/>
         </w:rPr>
         <w:t xml:space="preserve"> trois lettres</w:t>
       </w:r>
@@ -1162,6 +1190,7 @@
         <w:rPr>
           <w:sz w:val="24"/>
           <w:szCs w:val="24"/>
+          <w:highlight w:val="yellow"/>
         </w:rPr>
         <w:t xml:space="preserve"> majuscules</w:t>
       </w:r>
@@ -1169,6 +1198,7 @@
         <w:rPr>
           <w:sz w:val="24"/>
           <w:szCs w:val="24"/>
+          <w:highlight w:val="yellow"/>
         </w:rPr>
         <w:t>.</w:t>
       </w:r>
@@ -1176,6 +1206,7 @@
         <w:rPr>
           <w:sz w:val="24"/>
           <w:szCs w:val="24"/>
+          <w:highlight w:val="yellow"/>
         </w:rPr>
         <w:t xml:space="preserve"> Le pays doit maintenant remplacer l’attribut </w:t>
       </w:r>
@@ -1184,6 +1215,7 @@
         <w:rPr>
           <w:sz w:val="24"/>
           <w:szCs w:val="24"/>
+          <w:highlight w:val="yellow"/>
         </w:rPr>
         <w:t>paysOrigine</w:t>
       </w:r>
@@ -1192,6 +1224,7 @@
         <w:rPr>
           <w:sz w:val="24"/>
           <w:szCs w:val="24"/>
+          <w:highlight w:val="yellow"/>
         </w:rPr>
         <w:t xml:space="preserve"> de l’Auteur qui passe de String à Pays, et corrigez ce qui doit l’</w:t>
       </w:r>
@@ -1199,6 +1232,7 @@
         <w:rPr>
           <w:sz w:val="24"/>
           <w:szCs w:val="24"/>
+          <w:highlight w:val="yellow"/>
         </w:rPr>
         <w:t>être</w:t>
       </w:r>
@@ -1206,6 +1240,7 @@
         <w:rPr>
           <w:sz w:val="24"/>
           <w:szCs w:val="24"/>
+          <w:highlight w:val="yellow"/>
         </w:rPr>
         <w:t xml:space="preserve">. </w:t>
       </w:r>
@@ -1221,7 +1256,7 @@
     </w:p>
     <w:p>
       <w:pPr>
-        <w:pStyle w:val="ListParagraph"/>
+        <w:pStyle w:val="Paragraphedeliste"/>
         <w:numPr>
           <w:ilvl w:val="0"/>
           <w:numId w:val="17"/>
@@ -1229,12 +1264,14 @@
         <w:rPr>
           <w:sz w:val="24"/>
           <w:szCs w:val="24"/>
-        </w:rPr>
-      </w:pPr>
-      <w:r>
-        <w:rPr>
-          <w:sz w:val="24"/>
-          <w:szCs w:val="24"/>
+          <w:highlight w:val="red"/>
+        </w:rPr>
+      </w:pPr>
+      <w:r>
+        <w:rPr>
+          <w:sz w:val="24"/>
+          <w:szCs w:val="24"/>
+          <w:highlight w:val="red"/>
         </w:rPr>
         <w:t xml:space="preserve">Lorsque c’est terminé </w:t>
       </w:r>
@@ -1242,6 +1279,7 @@
         <w:rPr>
           <w:sz w:val="24"/>
           <w:szCs w:val="24"/>
+          <w:highlight w:val="red"/>
         </w:rPr>
         <w:t>inversez les rôles pour écrire les méthodes de test de vos nouvelles classes</w:t>
       </w:r>
@@ -1249,6 +1287,7 @@
         <w:rPr>
           <w:sz w:val="24"/>
           <w:szCs w:val="24"/>
+          <w:highlight w:val="red"/>
         </w:rPr>
         <w:t xml:space="preserve"> dans TestOuvrages.java</w:t>
       </w:r>
@@ -1256,6 +1295,7 @@
         <w:rPr>
           <w:sz w:val="24"/>
           <w:szCs w:val="24"/>
+          <w:highlight w:val="red"/>
         </w:rPr>
         <w:t>,</w:t>
       </w:r>
@@ -1263,6 +1303,7 @@
         <w:rPr>
           <w:sz w:val="24"/>
           <w:szCs w:val="24"/>
+          <w:highlight w:val="red"/>
         </w:rPr>
         <w:t xml:space="preserve"> mais</w:t>
       </w:r>
@@ -1270,6 +1311,7 @@
         <w:rPr>
           <w:sz w:val="24"/>
           <w:szCs w:val="24"/>
+          <w:highlight w:val="red"/>
         </w:rPr>
         <w:t xml:space="preserve"> </w:t>
       </w:r>
@@ -1277,22 +1319,24 @@
         <w:rPr>
           <w:sz w:val="24"/>
           <w:szCs w:val="24"/>
+          <w:highlight w:val="red"/>
         </w:rPr>
         <w:t xml:space="preserve">au minimum : </w:t>
       </w:r>
     </w:p>
     <w:p>
       <w:pPr>
-        <w:pStyle w:val="ListParagraph"/>
-        <w:rPr>
-          <w:sz w:val="24"/>
-          <w:szCs w:val="24"/>
+        <w:pStyle w:val="Paragraphedeliste"/>
+        <w:rPr>
+          <w:sz w:val="24"/>
+          <w:szCs w:val="24"/>
+          <w:highlight w:val="red"/>
         </w:rPr>
       </w:pPr>
     </w:p>
     <w:p>
       <w:pPr>
-        <w:pStyle w:val="ListParagraph"/>
+        <w:pStyle w:val="Paragraphedeliste"/>
         <w:numPr>
           <w:ilvl w:val="1"/>
           <w:numId w:val="17"/>
@@ -1300,12 +1344,14 @@
         <w:rPr>
           <w:sz w:val="24"/>
           <w:szCs w:val="24"/>
-        </w:rPr>
-      </w:pPr>
-      <w:r>
-        <w:rPr>
-          <w:sz w:val="24"/>
-          <w:szCs w:val="24"/>
+          <w:highlight w:val="yellow"/>
+        </w:rPr>
+      </w:pPr>
+      <w:r>
+        <w:rPr>
+          <w:sz w:val="24"/>
+          <w:szCs w:val="24"/>
+          <w:highlight w:val="yellow"/>
         </w:rPr>
         <w:t>Créer</w:t>
       </w:r>
@@ -1313,6 +1359,7 @@
         <w:rPr>
           <w:sz w:val="24"/>
           <w:szCs w:val="24"/>
+          <w:highlight w:val="yellow"/>
         </w:rPr>
         <w:t xml:space="preserve"> une </w:t>
       </w:r>
@@ -1320,6 +1367,7 @@
         <w:rPr>
           <w:sz w:val="24"/>
           <w:szCs w:val="24"/>
+          <w:highlight w:val="yellow"/>
         </w:rPr>
         <w:t>Serie</w:t>
       </w:r>
@@ -1327,6 +1375,7 @@
         <w:rPr>
           <w:sz w:val="24"/>
           <w:szCs w:val="24"/>
+          <w:highlight w:val="yellow"/>
         </w:rPr>
         <w:t xml:space="preserve">, </w:t>
       </w:r>
@@ -1334,6 +1383,7 @@
         <w:rPr>
           <w:sz w:val="24"/>
           <w:szCs w:val="24"/>
+          <w:highlight w:val="yellow"/>
         </w:rPr>
         <w:t xml:space="preserve">y ajouter </w:t>
       </w:r>
@@ -1341,6 +1391,7 @@
         <w:rPr>
           <w:sz w:val="24"/>
           <w:szCs w:val="24"/>
+          <w:highlight w:val="yellow"/>
         </w:rPr>
         <w:t xml:space="preserve">un ou </w:t>
       </w:r>
@@ -1348,6 +1399,7 @@
         <w:rPr>
           <w:sz w:val="24"/>
           <w:szCs w:val="24"/>
+          <w:highlight w:val="yellow"/>
         </w:rPr>
         <w:t xml:space="preserve">des </w:t>
       </w:r>
@@ -1355,20 +1407,15 @@
         <w:rPr>
           <w:sz w:val="24"/>
           <w:szCs w:val="24"/>
-        </w:rPr>
-        <w:t>ouvrages</w:t>
-      </w:r>
-      <w:r>
-        <w:rPr>
-          <w:sz w:val="24"/>
-          <w:szCs w:val="24"/>
-        </w:rPr>
-        <w:t>, enlever</w:t>
-      </w:r>
-      <w:r>
-        <w:rPr>
-          <w:sz w:val="24"/>
-          <w:szCs w:val="24"/>
+          <w:highlight w:val="yellow"/>
+        </w:rPr>
+        <w:t>ouvrages, enlever</w:t>
+      </w:r>
+      <w:r>
+        <w:rPr>
+          <w:sz w:val="24"/>
+          <w:szCs w:val="24"/>
+          <w:highlight w:val="yellow"/>
         </w:rPr>
         <w:t xml:space="preserve"> </w:t>
       </w:r>
@@ -1376,6 +1423,7 @@
         <w:rPr>
           <w:sz w:val="24"/>
           <w:szCs w:val="24"/>
+          <w:highlight w:val="yellow"/>
         </w:rPr>
         <w:t xml:space="preserve">un ou </w:t>
       </w:r>
@@ -1383,6 +1431,7 @@
         <w:rPr>
           <w:sz w:val="24"/>
           <w:szCs w:val="24"/>
+          <w:highlight w:val="yellow"/>
         </w:rPr>
         <w:t>des ouvrage</w:t>
       </w:r>
@@ -1390,6 +1439,7 @@
         <w:rPr>
           <w:sz w:val="24"/>
           <w:szCs w:val="24"/>
+          <w:highlight w:val="yellow"/>
         </w:rPr>
         <w:t>s</w:t>
       </w:r>
@@ -1397,6 +1447,7 @@
         <w:rPr>
           <w:sz w:val="24"/>
           <w:szCs w:val="24"/>
+          <w:highlight w:val="yellow"/>
         </w:rPr>
         <w:t xml:space="preserve">. </w:t>
       </w:r>
@@ -1404,13 +1455,14 @@
         <w:rPr>
           <w:sz w:val="24"/>
           <w:szCs w:val="24"/>
+          <w:highlight w:val="yellow"/>
         </w:rPr>
         <w:t xml:space="preserve"> </w:t>
       </w:r>
     </w:p>
     <w:p>
       <w:pPr>
-        <w:pStyle w:val="ListParagraph"/>
+        <w:pStyle w:val="Paragraphedeliste"/>
         <w:numPr>
           <w:ilvl w:val="1"/>
           <w:numId w:val="17"/>
@@ -1418,12 +1470,14 @@
         <w:rPr>
           <w:sz w:val="24"/>
           <w:szCs w:val="24"/>
-        </w:rPr>
-      </w:pPr>
-      <w:r>
-        <w:rPr>
-          <w:sz w:val="24"/>
-          <w:szCs w:val="24"/>
+          <w:highlight w:val="red"/>
+        </w:rPr>
+      </w:pPr>
+      <w:r>
+        <w:rPr>
+          <w:sz w:val="24"/>
+          <w:szCs w:val="24"/>
+          <w:highlight w:val="red"/>
         </w:rPr>
         <w:t>Créer</w:t>
       </w:r>
@@ -1431,6 +1485,7 @@
         <w:rPr>
           <w:sz w:val="24"/>
           <w:szCs w:val="24"/>
+          <w:highlight w:val="red"/>
         </w:rPr>
         <w:t xml:space="preserve"> un pays </w:t>
       </w:r>
@@ -1438,6 +1493,7 @@
         <w:rPr>
           <w:sz w:val="24"/>
           <w:szCs w:val="24"/>
+          <w:highlight w:val="red"/>
         </w:rPr>
         <w:t>vérifier que le code de pays ne peu</w:t>
       </w:r>
@@ -1445,6 +1501,7 @@
         <w:rPr>
           <w:sz w:val="24"/>
           <w:szCs w:val="24"/>
+          <w:highlight w:val="red"/>
         </w:rPr>
         <w:t>t</w:t>
       </w:r>
@@ -1452,20 +1509,15 @@
         <w:rPr>
           <w:sz w:val="24"/>
           <w:szCs w:val="24"/>
-        </w:rPr>
-        <w:t xml:space="preserve"> pas être invalide et </w:t>
-      </w:r>
-      <w:r>
-        <w:rPr>
-          <w:sz w:val="24"/>
-          <w:szCs w:val="24"/>
-        </w:rPr>
-        <w:t xml:space="preserve">le lier à un </w:t>
-      </w:r>
-      <w:r>
-        <w:rPr>
-          <w:sz w:val="24"/>
-          <w:szCs w:val="24"/>
+          <w:highlight w:val="red"/>
+        </w:rPr>
+        <w:t xml:space="preserve"> pas être invalide et le lier à un </w:t>
+      </w:r>
+      <w:r>
+        <w:rPr>
+          <w:sz w:val="24"/>
+          <w:szCs w:val="24"/>
+          <w:highlight w:val="red"/>
         </w:rPr>
         <w:t>auteur</w:t>
       </w:r>
@@ -1473,6 +1525,7 @@
         <w:rPr>
           <w:sz w:val="24"/>
           <w:szCs w:val="24"/>
+          <w:highlight w:val="red"/>
         </w:rPr>
         <w:t xml:space="preserve"> existant</w:t>
       </w:r>
@@ -1480,6 +1533,7 @@
         <w:rPr>
           <w:sz w:val="24"/>
           <w:szCs w:val="24"/>
+          <w:highlight w:val="red"/>
         </w:rPr>
         <w:t>.</w:t>
       </w:r>
@@ -1502,7 +1556,7 @@
     </w:p>
     <w:tbl>
       <w:tblPr>
-        <w:tblStyle w:val="TableGrid"/>
+        <w:tblStyle w:val="Grilledutableau"/>
         <w:tblW w:w="0" w:type="auto"/>
         <w:tblLook w:val="04A0" w:firstRow="1" w:lastRow="0" w:firstColumn="1" w:lastColumn="0" w:noHBand="0" w:noVBand="1"/>
       </w:tblPr>
@@ -1610,6 +1664,48 @@
                 <w:szCs w:val="24"/>
               </w:rPr>
             </w:pPr>
+            <w:r>
+              <w:rPr>
+                <w:noProof/>
+                <w:sz w:val="24"/>
+                <w:szCs w:val="24"/>
+              </w:rPr>
+              <w:drawing>
+                <wp:inline distT="0" distB="0" distL="0" distR="0" wp14:anchorId="186E6746" wp14:editId="6034A926">
+                  <wp:extent cx="5038725" cy="2712888"/>
+                  <wp:effectExtent l="0" t="0" r="0" b="0"/>
+                  <wp:docPr id="1546353082" name="Image 1"/>
+                  <wp:cNvGraphicFramePr>
+                    <a:graphicFrameLocks xmlns:a="http://schemas.openxmlformats.org/drawingml/2006/main" noChangeAspect="1"/>
+                  </wp:cNvGraphicFramePr>
+                  <a:graphic xmlns:a="http://schemas.openxmlformats.org/drawingml/2006/main">
+                    <a:graphicData uri="http://schemas.openxmlformats.org/drawingml/2006/picture">
+                      <pic:pic xmlns:pic="http://schemas.openxmlformats.org/drawingml/2006/picture">
+                        <pic:nvPicPr>
+                          <pic:cNvPr id="1546353082" name=""/>
+                          <pic:cNvPicPr/>
+                        </pic:nvPicPr>
+                        <pic:blipFill>
+                          <a:blip r:embed="rId11"/>
+                          <a:stretch>
+                            <a:fillRect/>
+                          </a:stretch>
+                        </pic:blipFill>
+                        <pic:spPr>
+                          <a:xfrm>
+                            <a:off x="0" y="0"/>
+                            <a:ext cx="5043261" cy="2715330"/>
+                          </a:xfrm>
+                          <a:prstGeom prst="rect">
+                            <a:avLst/>
+                          </a:prstGeom>
+                        </pic:spPr>
+                      </pic:pic>
+                    </a:graphicData>
+                  </a:graphic>
+                </wp:inline>
+              </w:drawing>
+            </w:r>
           </w:p>
           <w:p>
             <w:pPr>
@@ -1618,6 +1714,97 @@
                 <w:szCs w:val="24"/>
               </w:rPr>
             </w:pPr>
+            <w:r>
+              <w:rPr>
+                <w:noProof/>
+                <w:sz w:val="24"/>
+                <w:szCs w:val="24"/>
+              </w:rPr>
+              <w:lastRenderedPageBreak/>
+              <w:drawing>
+                <wp:inline distT="0" distB="0" distL="0" distR="0" wp14:anchorId="22F6819D" wp14:editId="65D72239">
+                  <wp:extent cx="4220164" cy="400106"/>
+                  <wp:effectExtent l="0" t="0" r="0" b="0"/>
+                  <wp:docPr id="986313628" name="Image 1"/>
+                  <wp:cNvGraphicFramePr>
+                    <a:graphicFrameLocks xmlns:a="http://schemas.openxmlformats.org/drawingml/2006/main" noChangeAspect="1"/>
+                  </wp:cNvGraphicFramePr>
+                  <a:graphic xmlns:a="http://schemas.openxmlformats.org/drawingml/2006/main">
+                    <a:graphicData uri="http://schemas.openxmlformats.org/drawingml/2006/picture">
+                      <pic:pic xmlns:pic="http://schemas.openxmlformats.org/drawingml/2006/picture">
+                        <pic:nvPicPr>
+                          <pic:cNvPr id="986313628" name=""/>
+                          <pic:cNvPicPr/>
+                        </pic:nvPicPr>
+                        <pic:blipFill>
+                          <a:blip r:embed="rId12"/>
+                          <a:stretch>
+                            <a:fillRect/>
+                          </a:stretch>
+                        </pic:blipFill>
+                        <pic:spPr>
+                          <a:xfrm>
+                            <a:off x="0" y="0"/>
+                            <a:ext cx="4220164" cy="400106"/>
+                          </a:xfrm>
+                          <a:prstGeom prst="rect">
+                            <a:avLst/>
+                          </a:prstGeom>
+                        </pic:spPr>
+                      </pic:pic>
+                    </a:graphicData>
+                  </a:graphic>
+                </wp:inline>
+              </w:drawing>
+            </w:r>
+            <w:r>
+              <w:rPr>
+                <w:sz w:val="24"/>
+                <w:szCs w:val="24"/>
+              </w:rPr>
+              <w:drawing>
+                <wp:inline distT="0" distB="0" distL="0" distR="0" wp14:anchorId="4C12465E" wp14:editId="5FB51B46">
+                  <wp:extent cx="6332220" cy="5643880"/>
+                  <wp:effectExtent l="0" t="0" r="0" b="0"/>
+                  <wp:docPr id="952448933" name="Image 1"/>
+                  <wp:cNvGraphicFramePr>
+                    <a:graphicFrameLocks xmlns:a="http://schemas.openxmlformats.org/drawingml/2006/main" noChangeAspect="1"/>
+                  </wp:cNvGraphicFramePr>
+                  <a:graphic xmlns:a="http://schemas.openxmlformats.org/drawingml/2006/main">
+                    <a:graphicData uri="http://schemas.openxmlformats.org/drawingml/2006/picture">
+                      <pic:pic xmlns:pic="http://schemas.openxmlformats.org/drawingml/2006/picture">
+                        <pic:nvPicPr>
+                          <pic:cNvPr id="952448933" name=""/>
+                          <pic:cNvPicPr/>
+                        </pic:nvPicPr>
+                        <pic:blipFill>
+                          <a:blip r:embed="rId13"/>
+                          <a:stretch>
+                            <a:fillRect/>
+                          </a:stretch>
+                        </pic:blipFill>
+                        <pic:spPr>
+                          <a:xfrm>
+                            <a:off x="0" y="0"/>
+                            <a:ext cx="6332220" cy="5643880"/>
+                          </a:xfrm>
+                          <a:prstGeom prst="rect">
+                            <a:avLst/>
+                          </a:prstGeom>
+                        </pic:spPr>
+                      </pic:pic>
+                    </a:graphicData>
+                  </a:graphic>
+                </wp:inline>
+              </w:drawing>
+            </w:r>
+            <w:r>
+              <w:rPr>
+                <w:sz w:val="24"/>
+                <w:szCs w:val="24"/>
+              </w:rPr>
+              <w:t xml:space="preserve"> </w:t>
+            </w:r>
           </w:p>
         </w:tc>
       </w:tr>
@@ -1632,7 +1819,7 @@
     </w:p>
     <w:tbl>
       <w:tblPr>
-        <w:tblStyle w:val="TableGrid"/>
+        <w:tblStyle w:val="Grilledutableau"/>
         <w:tblW w:w="0" w:type="auto"/>
         <w:tblLook w:val="04A0" w:firstRow="1" w:lastRow="0" w:firstColumn="1" w:lastColumn="0" w:noHBand="0" w:noVBand="1"/>
       </w:tblPr>
@@ -1674,30 +1861,49 @@
                 <w:szCs w:val="24"/>
               </w:rPr>
             </w:pPr>
-          </w:p>
-          <w:p>
-            <w:pPr>
+            <w:r>
               <w:rPr>
+                <w:noProof/>
                 <w:sz w:val="24"/>
                 <w:szCs w:val="24"/>
               </w:rPr>
-            </w:pPr>
-          </w:p>
-          <w:p>
-            <w:pPr>
-              <w:rPr>
-                <w:sz w:val="24"/>
-                <w:szCs w:val="24"/>
-              </w:rPr>
-            </w:pPr>
-          </w:p>
-          <w:p>
-            <w:pPr>
-              <w:rPr>
-                <w:sz w:val="24"/>
-                <w:szCs w:val="24"/>
-              </w:rPr>
-            </w:pPr>
+              <w:lastRenderedPageBreak/>
+              <w:drawing>
+                <wp:inline distT="0" distB="0" distL="0" distR="0" wp14:anchorId="3378D7BD" wp14:editId="04E24FDC">
+                  <wp:extent cx="5038725" cy="6976502"/>
+                  <wp:effectExtent l="0" t="0" r="0" b="0"/>
+                  <wp:docPr id="643554941" name="Image 1"/>
+                  <wp:cNvGraphicFramePr>
+                    <a:graphicFrameLocks xmlns:a="http://schemas.openxmlformats.org/drawingml/2006/main" noChangeAspect="1"/>
+                  </wp:cNvGraphicFramePr>
+                  <a:graphic xmlns:a="http://schemas.openxmlformats.org/drawingml/2006/main">
+                    <a:graphicData uri="http://schemas.openxmlformats.org/drawingml/2006/picture">
+                      <pic:pic xmlns:pic="http://schemas.openxmlformats.org/drawingml/2006/picture">
+                        <pic:nvPicPr>
+                          <pic:cNvPr id="643554941" name=""/>
+                          <pic:cNvPicPr/>
+                        </pic:nvPicPr>
+                        <pic:blipFill>
+                          <a:blip r:embed="rId14"/>
+                          <a:stretch>
+                            <a:fillRect/>
+                          </a:stretch>
+                        </pic:blipFill>
+                        <pic:spPr>
+                          <a:xfrm>
+                            <a:off x="0" y="0"/>
+                            <a:ext cx="5039990" cy="6978254"/>
+                          </a:xfrm>
+                          <a:prstGeom prst="rect">
+                            <a:avLst/>
+                          </a:prstGeom>
+                        </pic:spPr>
+                      </pic:pic>
+                    </a:graphicData>
+                  </a:graphic>
+                </wp:inline>
+              </w:drawing>
+            </w:r>
           </w:p>
         </w:tc>
       </w:tr>
@@ -1763,14 +1969,14 @@
     </w:p>
     <w:p>
       <w:pPr>
-        <w:pStyle w:val="Heading3"/>
-        <w:rPr>
-          <w:rStyle w:val="IntenseEmphasis"/>
-        </w:rPr>
-      </w:pPr>
-      <w:r>
-        <w:rPr>
-          <w:rStyle w:val="IntenseEmphasis"/>
+        <w:pStyle w:val="Titre3"/>
+        <w:rPr>
+          <w:rStyle w:val="Accentuationintense"/>
+        </w:rPr>
+      </w:pPr>
+      <w:r>
+        <w:rPr>
+          <w:rStyle w:val="Accentuationintense"/>
         </w:rPr>
         <w:lastRenderedPageBreak/>
         <w:t>Modification du modèle existant</w:t>
@@ -1786,7 +1992,7 @@
     </w:p>
     <w:p>
       <w:pPr>
-        <w:pStyle w:val="ListParagraph"/>
+        <w:pStyle w:val="Paragraphedeliste"/>
         <w:numPr>
           <w:ilvl w:val="0"/>
           <w:numId w:val="3"/>
@@ -1857,7 +2063,7 @@
     </w:p>
     <w:p>
       <w:pPr>
-        <w:pStyle w:val="ListParagraph"/>
+        <w:pStyle w:val="Paragraphedeliste"/>
         <w:numPr>
           <w:ilvl w:val="1"/>
           <w:numId w:val="3"/>
@@ -1888,7 +2094,7 @@
     </w:p>
     <w:p>
       <w:pPr>
-        <w:pStyle w:val="ListParagraph"/>
+        <w:pStyle w:val="Paragraphedeliste"/>
         <w:numPr>
           <w:ilvl w:val="1"/>
           <w:numId w:val="3"/>
@@ -1954,7 +2160,7 @@
     </w:p>
     <w:p>
       <w:pPr>
-        <w:pStyle w:val="ListParagraph"/>
+        <w:pStyle w:val="Paragraphedeliste"/>
         <w:numPr>
           <w:ilvl w:val="1"/>
           <w:numId w:val="3"/>
@@ -1993,7 +2199,7 @@
     </w:p>
     <w:p>
       <w:pPr>
-        <w:pStyle w:val="ListParagraph"/>
+        <w:pStyle w:val="Paragraphedeliste"/>
         <w:numPr>
           <w:ilvl w:val="0"/>
           <w:numId w:val="3"/>
@@ -2080,7 +2286,7 @@
     </w:p>
     <w:p>
       <w:pPr>
-        <w:pStyle w:val="ListParagraph"/>
+        <w:pStyle w:val="Paragraphedeliste"/>
         <w:ind w:left="360"/>
         <w:rPr>
           <w:sz w:val="24"/>
@@ -2090,7 +2296,7 @@
     </w:p>
     <w:p>
       <w:pPr>
-        <w:pStyle w:val="ListParagraph"/>
+        <w:pStyle w:val="Paragraphedeliste"/>
         <w:ind w:left="360"/>
         <w:rPr>
           <w:sz w:val="24"/>
@@ -2100,7 +2306,7 @@
     </w:p>
     <w:tbl>
       <w:tblPr>
-        <w:tblStyle w:val="TableGrid"/>
+        <w:tblStyle w:val="Grilledutableau"/>
         <w:tblW w:w="0" w:type="auto"/>
         <w:tblLook w:val="04A0" w:firstRow="1" w:lastRow="0" w:firstColumn="1" w:lastColumn="0" w:noHBand="0" w:noVBand="1"/>
       </w:tblPr>
@@ -2207,6 +2413,46 @@
                 <w:szCs w:val="24"/>
               </w:rPr>
             </w:pPr>
+            <w:r>
+              <w:rPr>
+                <w:noProof/>
+              </w:rPr>
+              <w:drawing>
+                <wp:inline distT="0" distB="0" distL="0" distR="0" wp14:anchorId="68740F83" wp14:editId="4783F65F">
+                  <wp:extent cx="6332220" cy="3021965"/>
+                  <wp:effectExtent l="0" t="0" r="0" b="6985"/>
+                  <wp:docPr id="494203704" name="Image 1"/>
+                  <wp:cNvGraphicFramePr>
+                    <a:graphicFrameLocks xmlns:a="http://schemas.openxmlformats.org/drawingml/2006/main" noChangeAspect="1"/>
+                  </wp:cNvGraphicFramePr>
+                  <a:graphic xmlns:a="http://schemas.openxmlformats.org/drawingml/2006/main">
+                    <a:graphicData uri="http://schemas.openxmlformats.org/drawingml/2006/picture">
+                      <pic:pic xmlns:pic="http://schemas.openxmlformats.org/drawingml/2006/picture">
+                        <pic:nvPicPr>
+                          <pic:cNvPr id="494203704" name=""/>
+                          <pic:cNvPicPr/>
+                        </pic:nvPicPr>
+                        <pic:blipFill>
+                          <a:blip r:embed="rId15"/>
+                          <a:stretch>
+                            <a:fillRect/>
+                          </a:stretch>
+                        </pic:blipFill>
+                        <pic:spPr>
+                          <a:xfrm>
+                            <a:off x="0" y="0"/>
+                            <a:ext cx="6332220" cy="3021965"/>
+                          </a:xfrm>
+                          <a:prstGeom prst="rect">
+                            <a:avLst/>
+                          </a:prstGeom>
+                        </pic:spPr>
+                      </pic:pic>
+                    </a:graphicData>
+                  </a:graphic>
+                </wp:inline>
+              </w:drawing>
+            </w:r>
           </w:p>
           <w:p>
             <w:pPr>
@@ -2215,6 +2461,88 @@
                 <w:szCs w:val="24"/>
               </w:rPr>
             </w:pPr>
+            <w:r>
+              <w:rPr>
+                <w:noProof/>
+              </w:rPr>
+              <w:lastRenderedPageBreak/>
+              <w:drawing>
+                <wp:inline distT="0" distB="0" distL="0" distR="0" wp14:anchorId="4598AB72" wp14:editId="0CF619F2">
+                  <wp:extent cx="5628571" cy="685714"/>
+                  <wp:effectExtent l="0" t="0" r="0" b="635"/>
+                  <wp:docPr id="96968690" name="Image 1"/>
+                  <wp:cNvGraphicFramePr>
+                    <a:graphicFrameLocks xmlns:a="http://schemas.openxmlformats.org/drawingml/2006/main" noChangeAspect="1"/>
+                  </wp:cNvGraphicFramePr>
+                  <a:graphic xmlns:a="http://schemas.openxmlformats.org/drawingml/2006/main">
+                    <a:graphicData uri="http://schemas.openxmlformats.org/drawingml/2006/picture">
+                      <pic:pic xmlns:pic="http://schemas.openxmlformats.org/drawingml/2006/picture">
+                        <pic:nvPicPr>
+                          <pic:cNvPr id="96968690" name=""/>
+                          <pic:cNvPicPr/>
+                        </pic:nvPicPr>
+                        <pic:blipFill>
+                          <a:blip r:embed="rId16"/>
+                          <a:stretch>
+                            <a:fillRect/>
+                          </a:stretch>
+                        </pic:blipFill>
+                        <pic:spPr>
+                          <a:xfrm>
+                            <a:off x="0" y="0"/>
+                            <a:ext cx="5628571" cy="685714"/>
+                          </a:xfrm>
+                          <a:prstGeom prst="rect">
+                            <a:avLst/>
+                          </a:prstGeom>
+                        </pic:spPr>
+                      </pic:pic>
+                    </a:graphicData>
+                  </a:graphic>
+                </wp:inline>
+              </w:drawing>
+            </w:r>
+            <w:r>
+              <w:rPr>
+                <w:sz w:val="24"/>
+                <w:szCs w:val="24"/>
+              </w:rPr>
+              <w:drawing>
+                <wp:inline distT="0" distB="0" distL="0" distR="0" wp14:anchorId="1BFC4E3D" wp14:editId="395239DA">
+                  <wp:extent cx="6332220" cy="6579870"/>
+                  <wp:effectExtent l="0" t="0" r="0" b="0"/>
+                  <wp:docPr id="1483210094" name="Image 1"/>
+                  <wp:cNvGraphicFramePr>
+                    <a:graphicFrameLocks xmlns:a="http://schemas.openxmlformats.org/drawingml/2006/main" noChangeAspect="1"/>
+                  </wp:cNvGraphicFramePr>
+                  <a:graphic xmlns:a="http://schemas.openxmlformats.org/drawingml/2006/main">
+                    <a:graphicData uri="http://schemas.openxmlformats.org/drawingml/2006/picture">
+                      <pic:pic xmlns:pic="http://schemas.openxmlformats.org/drawingml/2006/picture">
+                        <pic:nvPicPr>
+                          <pic:cNvPr id="1483210094" name=""/>
+                          <pic:cNvPicPr/>
+                        </pic:nvPicPr>
+                        <pic:blipFill>
+                          <a:blip r:embed="rId17"/>
+                          <a:stretch>
+                            <a:fillRect/>
+                          </a:stretch>
+                        </pic:blipFill>
+                        <pic:spPr>
+                          <a:xfrm>
+                            <a:off x="0" y="0"/>
+                            <a:ext cx="6332220" cy="6579870"/>
+                          </a:xfrm>
+                          <a:prstGeom prst="rect">
+                            <a:avLst/>
+                          </a:prstGeom>
+                        </pic:spPr>
+                      </pic:pic>
+                    </a:graphicData>
+                  </a:graphic>
+                </wp:inline>
+              </w:drawing>
+            </w:r>
           </w:p>
         </w:tc>
       </w:tr>
@@ -2259,7 +2587,7 @@
     </w:p>
     <w:tbl>
       <w:tblPr>
-        <w:tblStyle w:val="TableGrid"/>
+        <w:tblStyle w:val="Grilledutableau"/>
         <w:tblW w:w="0" w:type="auto"/>
         <w:tblLook w:val="04A0" w:firstRow="1" w:lastRow="0" w:firstColumn="1" w:lastColumn="0" w:noHBand="0" w:noVBand="1"/>
       </w:tblPr>
@@ -2293,38 +2621,49 @@
                 <w:szCs w:val="24"/>
               </w:rPr>
             </w:pPr>
-          </w:p>
-          <w:p>
-            <w:pPr>
+            <w:r>
               <w:rPr>
+                <w:noProof/>
                 <w:sz w:val="24"/>
                 <w:szCs w:val="24"/>
               </w:rPr>
-            </w:pPr>
-          </w:p>
-          <w:p>
-            <w:pPr>
-              <w:rPr>
-                <w:sz w:val="24"/>
-                <w:szCs w:val="24"/>
-              </w:rPr>
-            </w:pPr>
-          </w:p>
-          <w:p>
-            <w:pPr>
-              <w:rPr>
-                <w:sz w:val="24"/>
-                <w:szCs w:val="24"/>
-              </w:rPr>
-            </w:pPr>
-          </w:p>
-          <w:p>
-            <w:pPr>
-              <w:rPr>
-                <w:sz w:val="24"/>
-                <w:szCs w:val="24"/>
-              </w:rPr>
-            </w:pPr>
+              <w:lastRenderedPageBreak/>
+              <w:drawing>
+                <wp:inline distT="0" distB="0" distL="0" distR="0" wp14:anchorId="7DB992E6" wp14:editId="53458547">
+                  <wp:extent cx="6332220" cy="4467225"/>
+                  <wp:effectExtent l="0" t="0" r="0" b="9525"/>
+                  <wp:docPr id="1896737631" name="Image 1"/>
+                  <wp:cNvGraphicFramePr>
+                    <a:graphicFrameLocks xmlns:a="http://schemas.openxmlformats.org/drawingml/2006/main" noChangeAspect="1"/>
+                  </wp:cNvGraphicFramePr>
+                  <a:graphic xmlns:a="http://schemas.openxmlformats.org/drawingml/2006/main">
+                    <a:graphicData uri="http://schemas.openxmlformats.org/drawingml/2006/picture">
+                      <pic:pic xmlns:pic="http://schemas.openxmlformats.org/drawingml/2006/picture">
+                        <pic:nvPicPr>
+                          <pic:cNvPr id="1896737631" name=""/>
+                          <pic:cNvPicPr/>
+                        </pic:nvPicPr>
+                        <pic:blipFill>
+                          <a:blip r:embed="rId18"/>
+                          <a:stretch>
+                            <a:fillRect/>
+                          </a:stretch>
+                        </pic:blipFill>
+                        <pic:spPr>
+                          <a:xfrm>
+                            <a:off x="0" y="0"/>
+                            <a:ext cx="6332220" cy="4467225"/>
+                          </a:xfrm>
+                          <a:prstGeom prst="rect">
+                            <a:avLst/>
+                          </a:prstGeom>
+                        </pic:spPr>
+                      </pic:pic>
+                    </a:graphicData>
+                  </a:graphic>
+                </wp:inline>
+              </w:drawing>
+            </w:r>
           </w:p>
         </w:tc>
       </w:tr>
@@ -2362,7 +2701,7 @@
     </w:p>
     <w:p>
       <w:pPr>
-        <w:pStyle w:val="ListParagraph"/>
+        <w:pStyle w:val="Paragraphedeliste"/>
         <w:numPr>
           <w:ilvl w:val="0"/>
           <w:numId w:val="19"/>
@@ -2380,7 +2719,7 @@
     </w:p>
     <w:p>
       <w:pPr>
-        <w:pStyle w:val="ListParagraph"/>
+        <w:pStyle w:val="Paragraphedeliste"/>
         <w:numPr>
           <w:ilvl w:val="0"/>
           <w:numId w:val="19"/>
@@ -2397,7 +2736,7 @@
     </w:p>
     <w:p>
       <w:pPr>
-        <w:pStyle w:val="ListParagraph"/>
+        <w:pStyle w:val="Paragraphedeliste"/>
         <w:numPr>
           <w:ilvl w:val="0"/>
           <w:numId w:val="19"/>
@@ -2415,7 +2754,7 @@
     </w:p>
     <w:p>
       <w:pPr>
-        <w:pStyle w:val="ListParagraph"/>
+        <w:pStyle w:val="Paragraphedeliste"/>
         <w:numPr>
           <w:ilvl w:val="0"/>
           <w:numId w:val="19"/>
@@ -2430,7 +2769,7 @@
     </w:p>
     <w:p>
       <w:pPr>
-        <w:pStyle w:val="ListParagraph"/>
+        <w:pStyle w:val="Paragraphedeliste"/>
         <w:numPr>
           <w:ilvl w:val="0"/>
           <w:numId w:val="19"/>
@@ -2448,7 +2787,7 @@
     </w:p>
     <w:p>
       <w:pPr>
-        <w:pStyle w:val="ListParagraph"/>
+        <w:pStyle w:val="Paragraphedeliste"/>
         <w:numPr>
           <w:ilvl w:val="0"/>
           <w:numId w:val="19"/>
@@ -2462,7 +2801,7 @@
       </w:r>
     </w:p>
     <w:sectPr>
-      <w:footerReference w:type="default" r:id="rId11"/>
+      <w:footerReference w:type="default" r:id="rId19"/>
       <w:pgSz w:w="12240" w:h="15840" w:code="1"/>
       <w:pgMar w:top="851" w:right="1134" w:bottom="851" w:left="1134" w:header="680" w:footer="680" w:gutter="0"/>
       <w:cols w:space="720"/>
@@ -2494,7 +2833,7 @@
 <w:ftr xmlns:wpc="http://schemas.microsoft.com/office/word/2010/wordprocessingCanvas" xmlns:cx="http://schemas.microsoft.com/office/drawing/2014/chartex" xmlns:cx1="http://schemas.microsoft.com/office/drawing/2015/9/8/chartex" xmlns:cx2="http://schemas.microsoft.com/office/drawing/2015/10/21/chartex" xmlns:cx3="http://schemas.microsoft.com/office/drawing/2016/5/9/chartex" xmlns:cx4="http://schemas.microsoft.com/office/drawing/2016/5/10/chartex" xmlns:cx5="http://schemas.microsoft.com/office/drawing/2016/5/11/chartex" xmlns:cx6="http://schemas.microsoft.com/office/drawing/2016/5/12/chartex" xmlns:cx7="http://schemas.microsoft.com/office/drawing/2016/5/13/chartex" xmlns:cx8="http://schemas.microsoft.com/office/drawing/2016/5/14/chartex" xmlns:mc="http://schemas.openxmlformats.org/markup-compatibility/2006" xmlns:aink="http://schemas.microsoft.com/office/drawing/2016/ink" xmlns:am3d="http://schemas.microsoft.com/office/drawing/2017/model3d" xmlns:o="urn:schemas-microsoft-com:office:office" xmlns:oel="http://schemas.microsoft.com/office/2019/extlst" xmlns:r="http://schemas.openxmlformats.org/officeDocument/2006/relationships" xmlns:m="http://schemas.openxmlformats.org/officeDocument/2006/math" xmlns:v="urn:schemas-microsoft-com:vml" xmlns:wp14="http://schemas.microsoft.com/office/word/2010/wordprocessingDrawing" xmlns:wp="http://schemas.openxmlformats.org/drawingml/2006/wordprocessingDrawing" xmlns:w10="urn:schemas-microsoft-com:office:word" xmlns:w="http://schemas.openxmlformats.org/wordprocessingml/2006/main" xmlns:w14="http://schemas.microsoft.com/office/word/2010/wordml" xmlns:w15="http://schemas.microsoft.com/office/word/2012/wordml" xmlns:w16cex="http://schemas.microsoft.com/office/word/2018/wordml/cex" xmlns:w16cid="http://schemas.microsoft.com/office/word/2016/wordml/cid" xmlns:w16="http://schemas.microsoft.com/office/word/2018/wordml" xmlns:w16du="http://schemas.microsoft.com/office/word/2023/wordml/word16du" xmlns:w16sdtdh="http://schemas.microsoft.com/office/word/2020/wordml/sdtdatahash" xmlns:w16sdtfl="http://schemas.microsoft.com/office/word/2024/wordml/sdtformatlock" xmlns:w16se="http://schemas.microsoft.com/office/word/2015/wordml/symex" xmlns:wpg="http://schemas.microsoft.com/office/word/2010/wordprocessingGroup" xmlns:wpi="http://schemas.microsoft.com/office/word/2010/wordprocessingInk" xmlns:wne="http://schemas.microsoft.com/office/word/2006/wordml" xmlns:wps="http://schemas.microsoft.com/office/word/2010/wordprocessingShape" mc:Ignorable="w14 w15 w16se w16cid w16 w16cex w16sdtdh w16sdtfl w16du wp14">
   <w:p>
     <w:pPr>
-      <w:pStyle w:val="Footer"/>
+      <w:pStyle w:val="Pieddepage"/>
       <w:pBdr>
         <w:top w:val="single" w:sz="4" w:space="1" w:color="auto"/>
       </w:pBdr>
@@ -2506,7 +2845,7 @@
       </w:tabs>
       <w:ind w:right="4"/>
       <w:rPr>
-        <w:rStyle w:val="PageNumber"/>
+        <w:rStyle w:val="Numrodepage"/>
       </w:rPr>
     </w:pPr>
     <w:r>
@@ -2514,76 +2853,76 @@
     </w:r>
     <w:r>
       <w:rPr>
-        <w:rStyle w:val="PageNumber"/>
+        <w:rStyle w:val="Numrodepage"/>
       </w:rPr>
       <w:fldChar w:fldCharType="begin"/>
     </w:r>
     <w:r>
       <w:rPr>
-        <w:rStyle w:val="PageNumber"/>
+        <w:rStyle w:val="Numrodepage"/>
       </w:rPr>
       <w:instrText xml:space="preserve"> PAGE </w:instrText>
     </w:r>
     <w:r>
       <w:rPr>
-        <w:rStyle w:val="PageNumber"/>
+        <w:rStyle w:val="Numrodepage"/>
       </w:rPr>
       <w:fldChar w:fldCharType="separate"/>
     </w:r>
     <w:r>
       <w:rPr>
-        <w:rStyle w:val="PageNumber"/>
+        <w:rStyle w:val="Numrodepage"/>
         <w:noProof/>
       </w:rPr>
       <w:t>3</w:t>
     </w:r>
     <w:r>
       <w:rPr>
-        <w:rStyle w:val="PageNumber"/>
+        <w:rStyle w:val="Numrodepage"/>
       </w:rPr>
       <w:fldChar w:fldCharType="end"/>
     </w:r>
     <w:r>
       <w:rPr>
-        <w:rStyle w:val="PageNumber"/>
+        <w:rStyle w:val="Numrodepage"/>
       </w:rPr>
       <w:t>/</w:t>
     </w:r>
     <w:r>
       <w:rPr>
-        <w:rStyle w:val="PageNumber"/>
+        <w:rStyle w:val="Numrodepage"/>
       </w:rPr>
       <w:fldChar w:fldCharType="begin"/>
     </w:r>
     <w:r>
       <w:rPr>
-        <w:rStyle w:val="PageNumber"/>
+        <w:rStyle w:val="Numrodepage"/>
       </w:rPr>
       <w:instrText xml:space="preserve"> NUMPAGES </w:instrText>
     </w:r>
     <w:r>
       <w:rPr>
-        <w:rStyle w:val="PageNumber"/>
+        <w:rStyle w:val="Numrodepage"/>
       </w:rPr>
       <w:fldChar w:fldCharType="separate"/>
     </w:r>
     <w:r>
       <w:rPr>
-        <w:rStyle w:val="PageNumber"/>
+        <w:rStyle w:val="Numrodepage"/>
         <w:noProof/>
       </w:rPr>
       <w:t>3</w:t>
     </w:r>
     <w:r>
       <w:rPr>
-        <w:rStyle w:val="PageNumber"/>
+        <w:rStyle w:val="Numrodepage"/>
       </w:rPr>
       <w:fldChar w:fldCharType="end"/>
     </w:r>
   </w:p>
   <w:p>
     <w:pPr>
-      <w:pStyle w:val="Footer"/>
+      <w:pStyle w:val="Pieddepage"/>
       <w:tabs>
         <w:tab w:val="clear" w:pos="4320"/>
         <w:tab w:val="center" w:pos="4820"/>
@@ -2591,7 +2930,7 @@
     </w:pPr>
     <w:r>
       <w:rPr>
-        <w:rStyle w:val="PageNumber"/>
+        <w:rStyle w:val="Numrodepage"/>
       </w:rPr>
       <w:tab/>
     </w:r>
@@ -5844,7 +6183,7 @@
       <w:rFonts w:ascii="Arial" w:hAnsi="Arial"/>
     </w:rPr>
   </w:style>
-  <w:style w:type="paragraph" w:styleId="Heading1">
+  <w:style w:type="paragraph" w:styleId="Titre1">
     <w:name w:val="heading 1"/>
     <w:basedOn w:val="Normal"/>
     <w:next w:val="Normal"/>
@@ -5865,11 +6204,11 @@
       <w:sz w:val="22"/>
     </w:rPr>
   </w:style>
-  <w:style w:type="paragraph" w:styleId="Heading2">
+  <w:style w:type="paragraph" w:styleId="Titre2">
     <w:name w:val="heading 2"/>
     <w:basedOn w:val="Normal"/>
     <w:next w:val="Normal"/>
-    <w:link w:val="Heading2Char"/>
+    <w:link w:val="Titre2Car"/>
     <w:qFormat/>
     <w:rsid w:val="00670098"/>
     <w:pPr>
@@ -5881,7 +6220,7 @@
       <w:b/>
     </w:rPr>
   </w:style>
-  <w:style w:type="paragraph" w:styleId="Heading3">
+  <w:style w:type="paragraph" w:styleId="Titre3">
     <w:name w:val="heading 3"/>
     <w:basedOn w:val="Normal"/>
     <w:next w:val="Normal"/>
@@ -5897,7 +6236,7 @@
       <w:sz w:val="24"/>
     </w:rPr>
   </w:style>
-  <w:style w:type="paragraph" w:styleId="Heading4">
+  <w:style w:type="paragraph" w:styleId="Titre4">
     <w:name w:val="heading 4"/>
     <w:basedOn w:val="Normal"/>
     <w:next w:val="Normal"/>
@@ -5912,7 +6251,7 @@
       <w:sz w:val="22"/>
     </w:rPr>
   </w:style>
-  <w:style w:type="paragraph" w:styleId="Heading5">
+  <w:style w:type="paragraph" w:styleId="Titre5">
     <w:name w:val="heading 5"/>
     <w:basedOn w:val="Normal"/>
     <w:next w:val="Normal"/>
@@ -5927,7 +6266,7 @@
       <w:sz w:val="24"/>
     </w:rPr>
   </w:style>
-  <w:style w:type="paragraph" w:styleId="Heading6">
+  <w:style w:type="paragraph" w:styleId="Titre6">
     <w:name w:val="heading 6"/>
     <w:basedOn w:val="Normal"/>
     <w:next w:val="Normal"/>
@@ -5948,7 +6287,7 @@
       <w:sz w:val="28"/>
     </w:rPr>
   </w:style>
-  <w:style w:type="paragraph" w:styleId="Heading7">
+  <w:style w:type="paragraph" w:styleId="Titre7">
     <w:name w:val="heading 7"/>
     <w:basedOn w:val="Normal"/>
     <w:next w:val="Normal"/>
@@ -5963,7 +6302,7 @@
       <w:sz w:val="22"/>
     </w:rPr>
   </w:style>
-  <w:style w:type="paragraph" w:styleId="Heading8">
+  <w:style w:type="paragraph" w:styleId="Titre8">
     <w:name w:val="heading 8"/>
     <w:basedOn w:val="Normal"/>
     <w:next w:val="Normal"/>
@@ -5977,7 +6316,7 @@
       <w:sz w:val="22"/>
     </w:rPr>
   </w:style>
-  <w:style w:type="paragraph" w:styleId="Heading9">
+  <w:style w:type="paragraph" w:styleId="Titre9">
     <w:name w:val="heading 9"/>
     <w:basedOn w:val="Normal"/>
     <w:next w:val="Normal"/>
@@ -5993,13 +6332,13 @@
       <w:sz w:val="28"/>
     </w:rPr>
   </w:style>
-  <w:style w:type="character" w:default="1" w:styleId="DefaultParagraphFont">
+  <w:style w:type="character" w:default="1" w:styleId="Policepardfaut">
     <w:name w:val="Default Paragraph Font"/>
     <w:uiPriority w:val="1"/>
     <w:semiHidden/>
     <w:unhideWhenUsed/>
   </w:style>
-  <w:style w:type="table" w:default="1" w:styleId="TableNormal">
+  <w:style w:type="table" w:default="1" w:styleId="TableauNormal">
     <w:name w:val="Normal Table"/>
     <w:uiPriority w:val="99"/>
     <w:semiHidden/>
@@ -6014,13 +6353,13 @@
       </w:tblCellMar>
     </w:tblPr>
   </w:style>
-  <w:style w:type="numbering" w:default="1" w:styleId="NoList">
+  <w:style w:type="numbering" w:default="1" w:styleId="Aucuneliste">
     <w:name w:val="No List"/>
     <w:uiPriority w:val="99"/>
     <w:semiHidden/>
     <w:unhideWhenUsed/>
   </w:style>
-  <w:style w:type="paragraph" w:styleId="Header">
+  <w:style w:type="paragraph" w:styleId="En-tte">
     <w:name w:val="header"/>
     <w:basedOn w:val="Normal"/>
     <w:pPr>
@@ -6030,10 +6369,10 @@
       </w:tabs>
     </w:pPr>
   </w:style>
-  <w:style w:type="paragraph" w:styleId="Footer">
+  <w:style w:type="paragraph" w:styleId="Pieddepage">
     <w:name w:val="footer"/>
     <w:basedOn w:val="Normal"/>
-    <w:link w:val="FooterChar"/>
+    <w:link w:val="PieddepageCar"/>
     <w:pPr>
       <w:tabs>
         <w:tab w:val="center" w:pos="4320"/>
@@ -6041,9 +6380,9 @@
       </w:tabs>
     </w:pPr>
   </w:style>
-  <w:style w:type="character" w:styleId="PageNumber">
+  <w:style w:type="character" w:styleId="Numrodepage">
     <w:name w:val="page number"/>
-    <w:basedOn w:val="DefaultParagraphFont"/>
+    <w:basedOn w:val="Policepardfaut"/>
   </w:style>
   <w:style w:type="paragraph" w:customStyle="1" w:styleId="Lb1">
     <w:name w:val="Lb1"/>
@@ -6061,7 +6400,7 @@
       <w:lang w:val="fr-FR"/>
     </w:rPr>
   </w:style>
-  <w:style w:type="paragraph" w:styleId="BodyText">
+  <w:style w:type="paragraph" w:styleId="Corpsdetexte">
     <w:name w:val="Body Text"/>
     <w:basedOn w:val="Normal"/>
     <w:pPr>
@@ -6105,7 +6444,7 @@
   </w:style>
   <w:style w:type="paragraph" w:customStyle="1" w:styleId="titresection">
     <w:name w:val="titre section"/>
-    <w:basedOn w:val="Heading5"/>
+    <w:basedOn w:val="Titre5"/>
     <w:pPr>
       <w:pBdr>
         <w:top w:val="single" w:sz="4" w:space="1" w:color="auto"/>
@@ -6239,7 +6578,7 @@
       </w:tabs>
     </w:pPr>
   </w:style>
-  <w:style w:type="character" w:styleId="Hyperlink">
+  <w:style w:type="character" w:styleId="Lienhypertexte">
     <w:name w:val="Hyperlink"/>
     <w:rsid w:val="00177AA8"/>
     <w:rPr>
@@ -6303,7 +6642,7 @@
       <w:lang w:eastAsia="fr-CA"/>
     </w:rPr>
   </w:style>
-  <w:style w:type="character" w:styleId="FollowedHyperlink">
+  <w:style w:type="character" w:styleId="Lienhypertextesuivivisit">
     <w:name w:val="FollowedHyperlink"/>
     <w:rsid w:val="00A97EE7"/>
     <w:rPr>
@@ -6311,7 +6650,7 @@
       <w:u w:val="single"/>
     </w:rPr>
   </w:style>
-  <w:style w:type="paragraph" w:styleId="ListParagraph">
+  <w:style w:type="paragraph" w:styleId="Paragraphedeliste">
     <w:name w:val="List Paragraph"/>
     <w:basedOn w:val="Normal"/>
     <w:uiPriority w:val="34"/>
@@ -6323,12 +6662,12 @@
   </w:style>
   <w:style w:type="character" w:customStyle="1" w:styleId="apple-converted-space">
     <w:name w:val="apple-converted-space"/>
-    <w:basedOn w:val="DefaultParagraphFont"/>
+    <w:basedOn w:val="Policepardfaut"/>
     <w:rsid w:val="00F20EEA"/>
   </w:style>
   <w:style w:type="character" w:customStyle="1" w:styleId="notlocalizable">
     <w:name w:val="notlocalizable"/>
-    <w:basedOn w:val="DefaultParagraphFont"/>
+    <w:basedOn w:val="Policepardfaut"/>
     <w:rsid w:val="00F20EEA"/>
   </w:style>
   <w:style w:type="paragraph" w:customStyle="1" w:styleId="para">
@@ -6345,10 +6684,10 @@
       <w:lang w:eastAsia="fr-CA"/>
     </w:rPr>
   </w:style>
-  <w:style w:type="paragraph" w:styleId="BalloonText">
+  <w:style w:type="paragraph" w:styleId="Textedebulles">
     <w:name w:val="Balloon Text"/>
     <w:basedOn w:val="Normal"/>
-    <w:link w:val="BalloonTextChar"/>
+    <w:link w:val="TextedebullesCar"/>
     <w:rsid w:val="00976591"/>
     <w:rPr>
       <w:rFonts w:ascii="Lucida Grande" w:hAnsi="Lucida Grande" w:cs="Lucida Grande"/>
@@ -6356,10 +6695,10 @@
       <w:szCs w:val="18"/>
     </w:rPr>
   </w:style>
-  <w:style w:type="character" w:customStyle="1" w:styleId="BalloonTextChar">
-    <w:name w:val="Balloon Text Char"/>
-    <w:basedOn w:val="DefaultParagraphFont"/>
-    <w:link w:val="BalloonText"/>
+  <w:style w:type="character" w:customStyle="1" w:styleId="TextedebullesCar">
+    <w:name w:val="Texte de bulles Car"/>
+    <w:basedOn w:val="Policepardfaut"/>
+    <w:link w:val="Textedebulles"/>
     <w:rsid w:val="00976591"/>
     <w:rPr>
       <w:rFonts w:ascii="Lucida Grande" w:hAnsi="Lucida Grande" w:cs="Lucida Grande"/>
@@ -6383,9 +6722,9 @@
       <w:lang w:eastAsia="fr-CA"/>
     </w:rPr>
   </w:style>
-  <w:style w:type="character" w:customStyle="1" w:styleId="FooterChar">
-    <w:name w:val="Footer Char"/>
-    <w:link w:val="Footer"/>
+  <w:style w:type="character" w:customStyle="1" w:styleId="PieddepageCar">
+    <w:name w:val="Pied de page Car"/>
+    <w:link w:val="Pieddepage"/>
     <w:rsid w:val="001440F8"/>
     <w:rPr>
       <w:rFonts w:ascii="Arial" w:hAnsi="Arial"/>
@@ -6393,26 +6732,26 @@
   </w:style>
   <w:style w:type="character" w:customStyle="1" w:styleId="Mentionnonrsolue1">
     <w:name w:val="Mention non résolue1"/>
-    <w:basedOn w:val="DefaultParagraphFont"/>
+    <w:basedOn w:val="Policepardfaut"/>
     <w:rsid w:val="004A7E1D"/>
     <w:rPr>
       <w:color w:val="605E5C"/>
       <w:shd w:val="clear" w:color="auto" w:fill="E1DFDD"/>
     </w:rPr>
   </w:style>
-  <w:style w:type="character" w:customStyle="1" w:styleId="Heading2Char">
-    <w:name w:val="Heading 2 Char"/>
-    <w:basedOn w:val="DefaultParagraphFont"/>
-    <w:link w:val="Heading2"/>
+  <w:style w:type="character" w:customStyle="1" w:styleId="Titre2Car">
+    <w:name w:val="Titre 2 Car"/>
+    <w:basedOn w:val="Policepardfaut"/>
+    <w:link w:val="Titre2"/>
     <w:rsid w:val="00194479"/>
     <w:rPr>
       <w:rFonts w:ascii="Arial" w:hAnsi="Arial"/>
       <w:b/>
     </w:rPr>
   </w:style>
-  <w:style w:type="table" w:styleId="TableGrid">
+  <w:style w:type="table" w:styleId="Grilledutableau">
     <w:name w:val="Table Grid"/>
-    <w:basedOn w:val="TableNormal"/>
+    <w:basedOn w:val="TableauNormal"/>
     <w:rsid w:val="006C3CD4"/>
     <w:tblPr>
       <w:tblBorders>
@@ -6425,9 +6764,9 @@
       </w:tblBorders>
     </w:tblPr>
   </w:style>
-  <w:style w:type="character" w:styleId="IntenseEmphasis">
+  <w:style w:type="character" w:styleId="Accentuationintense">
     <w:name w:val="Intense Emphasis"/>
-    <w:basedOn w:val="DefaultParagraphFont"/>
+    <w:basedOn w:val="Policepardfaut"/>
     <w:uiPriority w:val="21"/>
     <w:qFormat/>
     <w:rsid w:val="00C407AC"/>
@@ -6761,21 +7100,12 @@
 </file>
 
 <file path=customXml/item1.xml><?xml version="1.0" encoding="utf-8"?>
-<?mso-contentType ?>
-<FormTemplates xmlns="http://schemas.microsoft.com/sharepoint/v3/contenttype/forms">
-  <Display>DocumentLibraryForm</Display>
-  <Edit>DocumentLibraryForm</Edit>
-  <New>DocumentLibraryForm</New>
-</FormTemplates>
-</file>
-
-<file path=customXml/item2.xml><?xml version="1.0" encoding="utf-8"?>
 <p:properties xmlns:p="http://schemas.microsoft.com/office/2006/metadata/properties" xmlns:xsi="http://www.w3.org/2001/XMLSchema-instance" xmlns:pc="http://schemas.microsoft.com/office/infopath/2007/PartnerControls">
   <documentManagement/>
 </p:properties>
 </file>
 
-<file path=customXml/item3.xml><?xml version="1.0" encoding="utf-8"?>
+<file path=customXml/item2.xml><?xml version="1.0" encoding="utf-8"?>
 <ct:contentTypeSchema xmlns:ct="http://schemas.microsoft.com/office/2006/metadata/contentType" xmlns:ma="http://schemas.microsoft.com/office/2006/metadata/properties/metaAttributes" ct:_="" ma:_="" ma:contentTypeName="Document" ma:contentTypeID="0x0101009C1B447D0B687849A1AF4D1976CDC009" ma:contentTypeVersion="12" ma:contentTypeDescription="Crée un document." ma:contentTypeScope="" ma:versionID="fe03336f97a1e4400bd691f3c50c45f2">
   <xsd:schema xmlns:xsd="http://www.w3.org/2001/XMLSchema" xmlns:xs="http://www.w3.org/2001/XMLSchema" xmlns:p="http://schemas.microsoft.com/office/2006/metadata/properties" xmlns:ns2="8b4e9889-ac42-40cc-888d-9712bfd820ad" xmlns:ns3="c69bbd0b-e922-4934-baed-3b7d43bfb0c6" targetNamespace="http://schemas.microsoft.com/office/2006/metadata/properties" ma:root="true" ma:fieldsID="f574614f4cec920772ca5d9ed687af9f" ns2:_="" ns3:_="">
     <xsd:import namespace="8b4e9889-ac42-40cc-888d-9712bfd820ad"/>
@@ -6992,19 +7322,20 @@
 </ct:contentTypeSchema>
 </file>
 
+<file path=customXml/item3.xml><?xml version="1.0" encoding="utf-8"?>
+<?mso-contentType ?>
+<FormTemplates xmlns="http://schemas.microsoft.com/sharepoint/v3/contenttype/forms">
+  <Display>DocumentLibraryForm</Display>
+  <Edit>DocumentLibraryForm</Edit>
+  <New>DocumentLibraryForm</New>
+</FormTemplates>
+</file>
+
 <file path=customXml/item4.xml><?xml version="1.0" encoding="utf-8"?>
 <b:Sources xmlns:b="http://schemas.openxmlformats.org/officeDocument/2006/bibliography" xmlns="http://schemas.openxmlformats.org/officeDocument/2006/bibliography" SelectedStyle="\APA.XSL" StyleName="APA"/>
 </file>
 
 <file path=customXml/itemProps1.xml><?xml version="1.0" encoding="utf-8"?>
-<ds:datastoreItem xmlns:ds="http://schemas.openxmlformats.org/officeDocument/2006/customXml" ds:itemID="{DC5743D9-90E8-4705-BD73-39E0AE4FDF6F}">
-  <ds:schemaRefs>
-    <ds:schemaRef ds:uri="http://schemas.microsoft.com/sharepoint/v3/contenttype/forms"/>
-  </ds:schemaRefs>
-</ds:datastoreItem>
-</file>
-
-<file path=customXml/itemProps2.xml><?xml version="1.0" encoding="utf-8"?>
 <ds:datastoreItem xmlns:ds="http://schemas.openxmlformats.org/officeDocument/2006/customXml" ds:itemID="{9DF1F198-947F-4E15-85D4-C4A2BF14403A}">
   <ds:schemaRefs>
     <ds:schemaRef ds:uri="http://schemas.microsoft.com/office/2006/metadata/properties"/>
@@ -7013,7 +7344,7 @@
 </ds:datastoreItem>
 </file>
 
-<file path=customXml/itemProps3.xml><?xml version="1.0" encoding="utf-8"?>
+<file path=customXml/itemProps2.xml><?xml version="1.0" encoding="utf-8"?>
 <ds:datastoreItem xmlns:ds="http://schemas.openxmlformats.org/officeDocument/2006/customXml" ds:itemID="{1BBC0A6D-47F3-44FE-AED0-DC85C3D3569D}">
   <ds:schemaRefs>
     <ds:schemaRef ds:uri="http://schemas.microsoft.com/office/2006/metadata/contentType"/>
@@ -7032,6 +7363,14 @@
 </ds:datastoreItem>
 </file>
 
+<file path=customXml/itemProps3.xml><?xml version="1.0" encoding="utf-8"?>
+<ds:datastoreItem xmlns:ds="http://schemas.openxmlformats.org/officeDocument/2006/customXml" ds:itemID="{DC5743D9-90E8-4705-BD73-39E0AE4FDF6F}">
+  <ds:schemaRefs>
+    <ds:schemaRef ds:uri="http://schemas.microsoft.com/sharepoint/v3/contenttype/forms"/>
+  </ds:schemaRefs>
+</ds:datastoreItem>
+</file>
+
 <file path=customXml/itemProps4.xml><?xml version="1.0" encoding="utf-8"?>
 <ds:datastoreItem xmlns:ds="http://schemas.openxmlformats.org/officeDocument/2006/customXml" ds:itemID="{2EF541C5-2E96-4453-A2B9-57DE2C8172DB}">
   <ds:schemaRefs>

</xml_diff>